<commit_message>
updated site plan to include wireframes
</commit_message>
<xml_diff>
--- a/Parkinson_Site_Plan.docx
+++ b/Parkinson_Site_Plan.docx
@@ -32,7 +32,15 @@
         </w:numPr>
       </w:pPr>
       <w:r>
-        <w:t xml:space="preserve">Corgi logo is prominent and featured next to the title of “Corgi.com” (note, this is a fictional website so pretend that the url would literally be </w:t>
+        <w:t xml:space="preserve">Corgi logo is prominent and featured next to the title of “Corgi.com” (note, this is a fictional website so pretend that the </w:t>
+      </w:r>
+      <w:proofErr w:type="spellStart"/>
+      <w:r>
+        <w:t>url</w:t>
+      </w:r>
+      <w:proofErr w:type="spellEnd"/>
+      <w:r>
+        <w:t xml:space="preserve"> would literally be </w:t>
       </w:r>
       <w:hyperlink r:id="rId5" w:history="1">
         <w:r>
@@ -262,6 +270,151 @@
                     <a:xfrm>
                       <a:off x="0" y="0"/>
                       <a:ext cx="5943600" cy="3241675"/>
+                    </a:xfrm>
+                    <a:prstGeom prst="rect">
+                      <a:avLst/>
+                    </a:prstGeom>
+                  </pic:spPr>
+                </pic:pic>
+              </a:graphicData>
+            </a:graphic>
+          </wp:inline>
+        </w:drawing>
+      </w:r>
+    </w:p>
+    <w:p>
+      <w:r>
+        <w:rPr>
+          <w:noProof/>
+        </w:rPr>
+        <w:drawing>
+          <wp:inline distT="0" distB="0" distL="0" distR="0" wp14:anchorId="1F57FCE4" wp14:editId="1CDE9CB8">
+            <wp:extent cx="5943600" cy="3154680"/>
+            <wp:effectExtent l="0" t="0" r="0" b="7620"/>
+            <wp:docPr id="1412193854" name="Picture 3"/>
+            <wp:cNvGraphicFramePr>
+              <a:graphicFrameLocks xmlns:a="http://schemas.openxmlformats.org/drawingml/2006/main" noChangeAspect="1"/>
+            </wp:cNvGraphicFramePr>
+            <a:graphic xmlns:a="http://schemas.openxmlformats.org/drawingml/2006/main">
+              <a:graphicData uri="http://schemas.openxmlformats.org/drawingml/2006/picture">
+                <pic:pic xmlns:pic="http://schemas.openxmlformats.org/drawingml/2006/picture">
+                  <pic:nvPicPr>
+                    <pic:cNvPr id="1412193854" name="Picture 1412193854"/>
+                    <pic:cNvPicPr/>
+                  </pic:nvPicPr>
+                  <pic:blipFill>
+                    <a:blip r:embed="rId7" cstate="print">
+                      <a:extLst>
+                        <a:ext uri="{28A0092B-C50C-407E-A947-70E740481C1C}">
+                          <a14:useLocalDpi xmlns:a14="http://schemas.microsoft.com/office/drawing/2010/main" val="0"/>
+                        </a:ext>
+                      </a:extLst>
+                    </a:blip>
+                    <a:stretch>
+                      <a:fillRect/>
+                    </a:stretch>
+                  </pic:blipFill>
+                  <pic:spPr>
+                    <a:xfrm>
+                      <a:off x="0" y="0"/>
+                      <a:ext cx="5943600" cy="3154680"/>
+                    </a:xfrm>
+                    <a:prstGeom prst="rect">
+                      <a:avLst/>
+                    </a:prstGeom>
+                  </pic:spPr>
+                </pic:pic>
+              </a:graphicData>
+            </a:graphic>
+          </wp:inline>
+        </w:drawing>
+      </w:r>
+    </w:p>
+    <w:p>
+      <w:r>
+        <w:rPr>
+          <w:noProof/>
+        </w:rPr>
+        <w:lastRenderedPageBreak/>
+        <w:drawing>
+          <wp:inline distT="0" distB="0" distL="0" distR="0" wp14:anchorId="73025936" wp14:editId="4BBFEC72">
+            <wp:extent cx="5943600" cy="3154680"/>
+            <wp:effectExtent l="0" t="0" r="0" b="7620"/>
+            <wp:docPr id="894218479" name="Picture 4"/>
+            <wp:cNvGraphicFramePr>
+              <a:graphicFrameLocks xmlns:a="http://schemas.openxmlformats.org/drawingml/2006/main" noChangeAspect="1"/>
+            </wp:cNvGraphicFramePr>
+            <a:graphic xmlns:a="http://schemas.openxmlformats.org/drawingml/2006/main">
+              <a:graphicData uri="http://schemas.openxmlformats.org/drawingml/2006/picture">
+                <pic:pic xmlns:pic="http://schemas.openxmlformats.org/drawingml/2006/picture">
+                  <pic:nvPicPr>
+                    <pic:cNvPr id="894218479" name="Picture 894218479"/>
+                    <pic:cNvPicPr/>
+                  </pic:nvPicPr>
+                  <pic:blipFill>
+                    <a:blip r:embed="rId8" cstate="print">
+                      <a:extLst>
+                        <a:ext uri="{28A0092B-C50C-407E-A947-70E740481C1C}">
+                          <a14:useLocalDpi xmlns:a14="http://schemas.microsoft.com/office/drawing/2010/main" val="0"/>
+                        </a:ext>
+                      </a:extLst>
+                    </a:blip>
+                    <a:stretch>
+                      <a:fillRect/>
+                    </a:stretch>
+                  </pic:blipFill>
+                  <pic:spPr>
+                    <a:xfrm>
+                      <a:off x="0" y="0"/>
+                      <a:ext cx="5943600" cy="3154680"/>
+                    </a:xfrm>
+                    <a:prstGeom prst="rect">
+                      <a:avLst/>
+                    </a:prstGeom>
+                  </pic:spPr>
+                </pic:pic>
+              </a:graphicData>
+            </a:graphic>
+          </wp:inline>
+        </w:drawing>
+      </w:r>
+    </w:p>
+    <w:p>
+      <w:r>
+        <w:rPr>
+          <w:noProof/>
+        </w:rPr>
+        <w:drawing>
+          <wp:inline distT="0" distB="0" distL="0" distR="0" wp14:anchorId="2964ED59" wp14:editId="7025D7D9">
+            <wp:extent cx="5943600" cy="3154680"/>
+            <wp:effectExtent l="0" t="0" r="0" b="7620"/>
+            <wp:docPr id="66637548" name="Picture 6"/>
+            <wp:cNvGraphicFramePr>
+              <a:graphicFrameLocks xmlns:a="http://schemas.openxmlformats.org/drawingml/2006/main" noChangeAspect="1"/>
+            </wp:cNvGraphicFramePr>
+            <a:graphic xmlns:a="http://schemas.openxmlformats.org/drawingml/2006/main">
+              <a:graphicData uri="http://schemas.openxmlformats.org/drawingml/2006/picture">
+                <pic:pic xmlns:pic="http://schemas.openxmlformats.org/drawingml/2006/picture">
+                  <pic:nvPicPr>
+                    <pic:cNvPr id="66637548" name="Picture 66637548"/>
+                    <pic:cNvPicPr/>
+                  </pic:nvPicPr>
+                  <pic:blipFill>
+                    <a:blip r:embed="rId9" cstate="print">
+                      <a:extLst>
+                        <a:ext uri="{28A0092B-C50C-407E-A947-70E740481C1C}">
+                          <a14:useLocalDpi xmlns:a14="http://schemas.microsoft.com/office/drawing/2010/main" val="0"/>
+                        </a:ext>
+                      </a:extLst>
+                    </a:blip>
+                    <a:stretch>
+                      <a:fillRect/>
+                    </a:stretch>
+                  </pic:blipFill>
+                  <pic:spPr>
+                    <a:xfrm>
+                      <a:off x="0" y="0"/>
+                      <a:ext cx="5943600" cy="3154680"/>
                     </a:xfrm>
                     <a:prstGeom prst="rect">
                       <a:avLst/>

</xml_diff>